<commit_message>
Commit: Adding Component List to Proposal.docx
</commit_message>
<xml_diff>
--- a/Proposal.docx
+++ b/Proposal.docx
@@ -215,23 +215,13 @@
                                           <w:szCs w:val="96"/>
                                         </w:rPr>
                                       </w:pPr>
-                                      <w:proofErr w:type="gramStart"/>
                                       <w:r>
                                         <w:rPr>
                                           <w:color w:val="FFFFFF" w:themeColor="background1"/>
                                           <w:sz w:val="96"/>
                                           <w:szCs w:val="96"/>
                                         </w:rPr>
-                                        <w:t>EW  Project</w:t>
-                                      </w:r>
-                                      <w:proofErr w:type="gramEnd"/>
-                                      <w:r>
-                                        <w:rPr>
-                                          <w:color w:val="FFFFFF" w:themeColor="background1"/>
-                                          <w:sz w:val="96"/>
-                                          <w:szCs w:val="96"/>
-                                        </w:rPr>
-                                        <w:t xml:space="preserve"> </w:t>
+                                        <w:t xml:space="preserve">EW  Project </w:t>
                                       </w:r>
                                     </w:p>
                                   </w:sdtContent>
@@ -312,7 +302,7 @@
                                         <w:rPr>
                                           <w:color w:val="FFFFFF" w:themeColor="background1"/>
                                         </w:rPr>
-                                        <w:t xml:space="preserve">Hamza Shahzad        </w:t>
+                                        <w:t>Hamza Shahzad</w:t>
                                       </w:r>
                                     </w:sdtContent>
                                   </w:sdt>
@@ -375,19 +365,11 @@
                                           <w:color w:val="FFFFFF" w:themeColor="background1"/>
                                         </w:rPr>
                                       </w:pPr>
-                                      <w:proofErr w:type="gramStart"/>
                                       <w:r>
                                         <w:rPr>
                                           <w:color w:val="FFFFFF" w:themeColor="background1"/>
                                         </w:rPr>
-                                        <w:t>EW  Project</w:t>
-                                      </w:r>
-                                      <w:proofErr w:type="gramEnd"/>
-                                      <w:r>
-                                        <w:rPr>
-                                          <w:color w:val="FFFFFF" w:themeColor="background1"/>
-                                        </w:rPr>
-                                        <w:t xml:space="preserve"> </w:t>
+                                        <w:t xml:space="preserve">EW  Project </w:t>
                                       </w:r>
                                     </w:p>
                                   </w:sdtContent>
@@ -414,7 +396,7 @@
                 <w:pict>
                   <v:group w14:anchorId="66B2E72E" id="Group 252" o:spid="_x0000_s1026" style="position:absolute;margin-left:193.95pt;margin-top:0;width:245.15pt;height:11in;z-index:251659264;mso-width-percent:400;mso-height-percent:1000;mso-position-horizontal:right;mso-position-horizontal-relative:page;mso-position-vertical:top;mso-position-vertical-relative:page;mso-width-percent:400;mso-height-percent:1000" coordsize="31136,100584" o:gfxdata="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">
                     <v:rect id="Rectangle 459" o:spid="_x0000_s1027" alt="Light vertical" style="position:absolute;width:1385;height:100584;visibility:visible;mso-wrap-style:square;v-text-anchor:middle" o:gfxdata="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" fillcolor="#c3a5a5 [1945]" stroked="f" strokecolor="white" strokeweight="1pt">
-                      <v:fill r:id="rId5" o:title="" opacity="52428f" color2="white [3212]" o:opacity2="52428f" type="pattern"/>
+                      <v:fill r:id="rId6" o:title="" opacity="52428f" color2="white [3212]" o:opacity2="52428f" type="pattern"/>
                       <v:shadow color="#d8d8d8" offset="3pt,3pt"/>
                     </v:rect>
                     <v:rect id="Rectangle 460" o:spid="_x0000_s1028" style="position:absolute;left:1246;width:29718;height:100584;visibility:visible;mso-wrap-style:square;v-text-anchor:top" o:gfxdata="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" fillcolor="#c3a5a5 [1945]" stroked="f" strokecolor="#d8d8d8"/>
@@ -450,23 +432,13 @@
                                     <w:szCs w:val="96"/>
                                   </w:rPr>
                                 </w:pPr>
-                                <w:proofErr w:type="gramStart"/>
                                 <w:r>
                                   <w:rPr>
                                     <w:color w:val="FFFFFF" w:themeColor="background1"/>
                                     <w:sz w:val="96"/>
                                     <w:szCs w:val="96"/>
                                   </w:rPr>
-                                  <w:t>EW  Project</w:t>
-                                </w:r>
-                                <w:proofErr w:type="gramEnd"/>
-                                <w:r>
-                                  <w:rPr>
-                                    <w:color w:val="FFFFFF" w:themeColor="background1"/>
-                                    <w:sz w:val="96"/>
-                                    <w:szCs w:val="96"/>
-                                  </w:rPr>
-                                  <w:t xml:space="preserve"> </w:t>
+                                  <w:t xml:space="preserve">EW  Project </w:t>
                                 </w:r>
                               </w:p>
                             </w:sdtContent>
@@ -502,7 +474,7 @@
                                   <w:rPr>
                                     <w:color w:val="FFFFFF" w:themeColor="background1"/>
                                   </w:rPr>
-                                  <w:t xml:space="preserve">Hamza Shahzad        </w:t>
+                                  <w:t>Hamza Shahzad</w:t>
                                 </w:r>
                               </w:sdtContent>
                             </w:sdt>
@@ -565,19 +537,11 @@
                                     <w:color w:val="FFFFFF" w:themeColor="background1"/>
                                   </w:rPr>
                                 </w:pPr>
-                                <w:proofErr w:type="gramStart"/>
                                 <w:r>
                                   <w:rPr>
                                     <w:color w:val="FFFFFF" w:themeColor="background1"/>
                                   </w:rPr>
-                                  <w:t>EW  Project</w:t>
-                                </w:r>
-                                <w:proofErr w:type="gramEnd"/>
-                                <w:r>
-                                  <w:rPr>
-                                    <w:color w:val="FFFFFF" w:themeColor="background1"/>
-                                  </w:rPr>
-                                  <w:t xml:space="preserve"> </w:t>
+                                  <w:t xml:space="preserve">EW  Project </w:t>
                                 </w:r>
                               </w:p>
                             </w:sdtContent>
@@ -763,7 +727,7 @@
               <w:noProof/>
             </w:rPr>
             <w:drawing>
-              <wp:anchor distT="0" distB="0" distL="114300" distR="114300" simplePos="0" relativeHeight="251660288" behindDoc="0" locked="0" layoutInCell="0" allowOverlap="1" wp14:anchorId="4C8C5D91" wp14:editId="659AFCA0">
+              <wp:anchor distT="0" distB="0" distL="114300" distR="114300" simplePos="0" relativeHeight="251660288" behindDoc="0" locked="0" layoutInCell="0" allowOverlap="1" wp14:anchorId="4C8C5D91" wp14:editId="3C61F2C7">
                 <wp:simplePos x="0" y="0"/>
                 <wp:positionH relativeFrom="page">
                   <wp:posOffset>2194560</wp:posOffset>
@@ -786,7 +750,7 @@
                         <pic:cNvPicPr/>
                       </pic:nvPicPr>
                       <pic:blipFill>
-                        <a:blip r:embed="rId6" cstate="print">
+                        <a:blip r:embed="rId7" cstate="print">
                           <a:extLst>
                             <a:ext uri="{28A0092B-C50C-407E-A947-70E740481C1C}">
                               <a14:useLocalDpi xmlns:a14="http://schemas.microsoft.com/office/drawing/2010/main" val="0"/>
@@ -879,6 +843,301 @@
           <w:szCs w:val="32"/>
         </w:rPr>
         <w:lastRenderedPageBreak/>
+        <w:t>List of Components:</w:t>
+      </w:r>
+    </w:p>
+    <w:p>
+      <w:pPr>
+        <w:pStyle w:val="ListParagraph"/>
+        <w:numPr>
+          <w:ilvl w:val="0"/>
+          <w:numId w:val="2"/>
+        </w:numPr>
+        <w:ind w:left="1080"/>
+        <w:rPr>
+          <w:b/>
+          <w:bCs/>
+          <w:sz w:val="32"/>
+          <w:szCs w:val="32"/>
+        </w:rPr>
+      </w:pPr>
+      <w:r>
+        <w:rPr>
+          <w:sz w:val="32"/>
+          <w:szCs w:val="32"/>
+        </w:rPr>
+        <w:t>DOIT ESP32 DEVKIT V1 (x2)</w:t>
+      </w:r>
+    </w:p>
+    <w:p>
+      <w:pPr>
+        <w:pStyle w:val="ListParagraph"/>
+        <w:numPr>
+          <w:ilvl w:val="0"/>
+          <w:numId w:val="2"/>
+        </w:numPr>
+        <w:ind w:left="1080"/>
+        <w:rPr>
+          <w:b/>
+          <w:bCs/>
+          <w:sz w:val="32"/>
+          <w:szCs w:val="32"/>
+        </w:rPr>
+      </w:pPr>
+      <w:r>
+        <w:rPr>
+          <w:sz w:val="32"/>
+          <w:szCs w:val="32"/>
+        </w:rPr>
+        <w:t>AI Thinker ESP32 CAM</w:t>
+      </w:r>
+    </w:p>
+    <w:p>
+      <w:pPr>
+        <w:pStyle w:val="ListParagraph"/>
+        <w:numPr>
+          <w:ilvl w:val="0"/>
+          <w:numId w:val="2"/>
+        </w:numPr>
+        <w:ind w:left="1080"/>
+        <w:rPr>
+          <w:b/>
+          <w:bCs/>
+          <w:sz w:val="32"/>
+          <w:szCs w:val="32"/>
+        </w:rPr>
+      </w:pPr>
+      <w:r>
+        <w:rPr>
+          <w:sz w:val="32"/>
+          <w:szCs w:val="32"/>
+        </w:rPr>
+        <w:t>4WD Car Chassis kit with 4 DC Gear Motors</w:t>
+      </w:r>
+    </w:p>
+    <w:p>
+      <w:pPr>
+        <w:pStyle w:val="ListParagraph"/>
+        <w:numPr>
+          <w:ilvl w:val="0"/>
+          <w:numId w:val="2"/>
+        </w:numPr>
+        <w:ind w:left="1080"/>
+        <w:rPr>
+          <w:b/>
+          <w:bCs/>
+          <w:sz w:val="32"/>
+          <w:szCs w:val="32"/>
+        </w:rPr>
+      </w:pPr>
+      <w:r>
+        <w:rPr>
+          <w:sz w:val="32"/>
+          <w:szCs w:val="32"/>
+        </w:rPr>
+        <w:t xml:space="preserve"> Male to Male Jumper Wires</w:t>
+      </w:r>
+    </w:p>
+    <w:p>
+      <w:pPr>
+        <w:pStyle w:val="ListParagraph"/>
+        <w:numPr>
+          <w:ilvl w:val="0"/>
+          <w:numId w:val="2"/>
+        </w:numPr>
+        <w:ind w:left="1080"/>
+        <w:rPr>
+          <w:b/>
+          <w:bCs/>
+          <w:sz w:val="32"/>
+          <w:szCs w:val="32"/>
+        </w:rPr>
+      </w:pPr>
+      <w:r>
+        <w:rPr>
+          <w:sz w:val="32"/>
+          <w:szCs w:val="32"/>
+        </w:rPr>
+        <w:t>Female to Male Jumper Wires</w:t>
+      </w:r>
+    </w:p>
+    <w:p>
+      <w:pPr>
+        <w:pStyle w:val="ListParagraph"/>
+        <w:numPr>
+          <w:ilvl w:val="0"/>
+          <w:numId w:val="2"/>
+        </w:numPr>
+        <w:ind w:left="1080"/>
+        <w:rPr>
+          <w:b/>
+          <w:bCs/>
+          <w:sz w:val="32"/>
+          <w:szCs w:val="32"/>
+        </w:rPr>
+      </w:pPr>
+      <w:r>
+        <w:rPr>
+          <w:sz w:val="32"/>
+          <w:szCs w:val="32"/>
+        </w:rPr>
+        <w:t>Female to Female Jumper Wires</w:t>
+      </w:r>
+    </w:p>
+    <w:p>
+      <w:pPr>
+        <w:pStyle w:val="ListParagraph"/>
+        <w:numPr>
+          <w:ilvl w:val="0"/>
+          <w:numId w:val="2"/>
+        </w:numPr>
+        <w:ind w:left="1080"/>
+        <w:rPr>
+          <w:b/>
+          <w:bCs/>
+          <w:sz w:val="32"/>
+          <w:szCs w:val="32"/>
+        </w:rPr>
+      </w:pPr>
+      <w:r>
+        <w:rPr>
+          <w:sz w:val="32"/>
+          <w:szCs w:val="32"/>
+        </w:rPr>
+        <w:t>2 Axis Joystick Modules (x2)</w:t>
+      </w:r>
+    </w:p>
+    <w:p>
+      <w:pPr>
+        <w:pStyle w:val="ListParagraph"/>
+        <w:numPr>
+          <w:ilvl w:val="0"/>
+          <w:numId w:val="2"/>
+        </w:numPr>
+        <w:ind w:left="1080"/>
+        <w:rPr>
+          <w:b/>
+          <w:bCs/>
+          <w:sz w:val="32"/>
+          <w:szCs w:val="32"/>
+        </w:rPr>
+      </w:pPr>
+      <w:r>
+        <w:rPr>
+          <w:sz w:val="32"/>
+          <w:szCs w:val="32"/>
+        </w:rPr>
+        <w:t>SG-90, 180-degree servo motor</w:t>
+      </w:r>
+    </w:p>
+    <w:p>
+      <w:pPr>
+        <w:pStyle w:val="ListParagraph"/>
+        <w:numPr>
+          <w:ilvl w:val="0"/>
+          <w:numId w:val="2"/>
+        </w:numPr>
+        <w:ind w:left="1080"/>
+        <w:rPr>
+          <w:b/>
+          <w:bCs/>
+          <w:sz w:val="32"/>
+          <w:szCs w:val="32"/>
+        </w:rPr>
+      </w:pPr>
+      <w:r>
+        <w:rPr>
+          <w:sz w:val="32"/>
+          <w:szCs w:val="32"/>
+        </w:rPr>
+        <w:t>Li-ion Batteries</w:t>
+      </w:r>
+    </w:p>
+    <w:p>
+      <w:pPr>
+        <w:pStyle w:val="ListParagraph"/>
+        <w:numPr>
+          <w:ilvl w:val="0"/>
+          <w:numId w:val="2"/>
+        </w:numPr>
+        <w:ind w:left="1080"/>
+        <w:rPr>
+          <w:b/>
+          <w:bCs/>
+          <w:sz w:val="32"/>
+          <w:szCs w:val="32"/>
+        </w:rPr>
+      </w:pPr>
+      <w:r>
+        <w:rPr>
+          <w:sz w:val="32"/>
+          <w:szCs w:val="32"/>
+        </w:rPr>
+        <w:t>Buck Convertor LM2596</w:t>
+      </w:r>
+    </w:p>
+    <w:p>
+      <w:pPr>
+        <w:pStyle w:val="ListParagraph"/>
+        <w:numPr>
+          <w:ilvl w:val="0"/>
+          <w:numId w:val="2"/>
+        </w:numPr>
+        <w:ind w:left="1080"/>
+        <w:rPr>
+          <w:b/>
+          <w:bCs/>
+          <w:sz w:val="32"/>
+          <w:szCs w:val="32"/>
+        </w:rPr>
+      </w:pPr>
+      <w:r>
+        <w:rPr>
+          <w:sz w:val="32"/>
+          <w:szCs w:val="32"/>
+        </w:rPr>
+        <w:t>L298N motor driver</w:t>
+      </w:r>
+    </w:p>
+    <w:p>
+      <w:pPr>
+        <w:pStyle w:val="ListParagraph"/>
+        <w:numPr>
+          <w:ilvl w:val="0"/>
+          <w:numId w:val="2"/>
+        </w:numPr>
+        <w:ind w:left="1080"/>
+        <w:rPr>
+          <w:b/>
+          <w:bCs/>
+          <w:sz w:val="32"/>
+          <w:szCs w:val="32"/>
+        </w:rPr>
+      </w:pPr>
+      <w:r>
+        <w:rPr>
+          <w:sz w:val="32"/>
+          <w:szCs w:val="32"/>
+        </w:rPr>
+        <w:t>AA battery housing</w:t>
+      </w:r>
+    </w:p>
+    <w:p>
+      <w:pPr>
+        <w:rPr>
+          <w:b/>
+          <w:bCs/>
+          <w:sz w:val="32"/>
+          <w:szCs w:val="32"/>
+        </w:rPr>
+      </w:pPr>
+      <w:r>
+        <w:rPr>
+          <w:b/>
+          <w:bCs/>
+          <w:sz w:val="32"/>
+          <w:szCs w:val="32"/>
+        </w:rPr>
         <w:t>Circuit Diagrams:</w:t>
       </w:r>
     </w:p>
@@ -955,7 +1214,7 @@
                           <pic:cNvPicPr/>
                         </pic:nvPicPr>
                         <pic:blipFill>
-                          <a:blip r:embed="rId7">
+                          <a:blip r:embed="rId8">
                             <a:extLst>
                               <a:ext uri="{28A0092B-C50C-407E-A947-70E740481C1C}">
                                 <a14:useLocalDpi xmlns:a14="http://schemas.microsoft.com/office/drawing/2010/main" val="0"/>
@@ -1033,6 +1292,7 @@
                 <w:sz w:val="32"/>
                 <w:szCs w:val="32"/>
               </w:rPr>
+              <w:lastRenderedPageBreak/>
               <w:drawing>
                 <wp:inline distT="0" distB="0" distL="0" distR="0" wp14:anchorId="70AA7B47" wp14:editId="54121398">
                   <wp:extent cx="3900904" cy="3497580"/>
@@ -1049,7 +1309,7 @@
                           <pic:cNvPicPr/>
                         </pic:nvPicPr>
                         <pic:blipFill>
-                          <a:blip r:embed="rId8">
+                          <a:blip r:embed="rId9">
                             <a:extLst>
                               <a:ext uri="{28A0092B-C50C-407E-A947-70E740481C1C}">
                                 <a14:useLocalDpi xmlns:a14="http://schemas.microsoft.com/office/drawing/2010/main" val="0"/>
@@ -1126,7 +1386,6 @@
                 <w:sz w:val="32"/>
                 <w:szCs w:val="32"/>
               </w:rPr>
-              <w:lastRenderedPageBreak/>
               <w:drawing>
                 <wp:inline distT="0" distB="0" distL="0" distR="0" wp14:anchorId="77164911" wp14:editId="691178A3">
                   <wp:extent cx="5943600" cy="2879090"/>
@@ -1143,7 +1402,7 @@
                           <pic:cNvPicPr/>
                         </pic:nvPicPr>
                         <pic:blipFill>
-                          <a:blip r:embed="rId9">
+                          <a:blip r:embed="rId10">
                             <a:extLst>
                               <a:ext uri="{28A0092B-C50C-407E-A947-70E740481C1C}">
                                 <a14:useLocalDpi xmlns:a14="http://schemas.microsoft.com/office/drawing/2010/main" val="0"/>
@@ -1203,6 +1462,189 @@
     </w:sectPr>
   </w:body>
 </w:document>
+</file>
+
+<file path=word/numbering.xml><?xml version="1.0" encoding="utf-8"?>
+<w:numbering xmlns:wpc="http://schemas.microsoft.com/office/word/2010/wordprocessingCanvas" xmlns:cx="http://schemas.microsoft.com/office/drawing/2014/chartex" xmlns:cx1="http://schemas.microsoft.com/office/drawing/2015/9/8/chartex" xmlns:cx2="http://schemas.microsoft.com/office/drawing/2015/10/21/chartex" xmlns:cx3="http://schemas.microsoft.com/office/drawing/2016/5/9/chartex" xmlns:cx4="http://schemas.microsoft.com/office/drawing/2016/5/10/chartex" xmlns:cx5="http://schemas.microsoft.com/office/drawing/2016/5/11/chartex" xmlns:cx6="http://schemas.microsoft.com/office/drawing/2016/5/12/chartex" xmlns:cx7="http://schemas.microsoft.com/office/drawing/2016/5/13/chartex" xmlns:cx8="http://schemas.microsoft.com/office/drawing/2016/5/14/chartex" xmlns:mc="http://schemas.openxmlformats.org/markup-compatibility/2006" xmlns:aink="http://schemas.microsoft.com/office/drawing/2016/ink" xmlns:am3d="http://schemas.microsoft.com/office/drawing/2017/model3d" xmlns:o="urn:schemas-microsoft-com:office:office" xmlns:oel="http://schemas.microsoft.com/office/2019/extlst" xmlns:r="http://schemas.openxmlformats.org/officeDocument/2006/relationships" xmlns:m="http://schemas.openxmlformats.org/officeDocument/2006/math" xmlns:v="urn:schemas-microsoft-com:vml" xmlns:wp14="http://schemas.microsoft.com/office/word/2010/wordprocessingDrawing" xmlns:wp="http://schemas.openxmlformats.org/drawingml/2006/wordprocessingDrawing" xmlns:w10="urn:schemas-microsoft-com:office:word" xmlns:w="http://schemas.openxmlformats.org/wordprocessingml/2006/main" xmlns:w14="http://schemas.microsoft.com/office/word/2010/wordml" xmlns:w15="http://schemas.microsoft.com/office/word/2012/wordml" xmlns:w16cex="http://schemas.microsoft.com/office/word/2018/wordml/cex" xmlns:w16cid="http://schemas.microsoft.com/office/word/2016/wordml/cid" xmlns:w16="http://schemas.microsoft.com/office/word/2018/wordml" xmlns:w16du="http://schemas.microsoft.com/office/word/2023/wordml/word16du" xmlns:w16sdtdh="http://schemas.microsoft.com/office/word/2020/wordml/sdtdatahash" xmlns:w16sdtfl="http://schemas.microsoft.com/office/word/2024/wordml/sdtformatlock" xmlns:w16se="http://schemas.microsoft.com/office/word/2015/wordml/symex" xmlns:wpg="http://schemas.microsoft.com/office/word/2010/wordprocessingGroup" xmlns:wpi="http://schemas.microsoft.com/office/word/2010/wordprocessingInk" xmlns:wne="http://schemas.microsoft.com/office/word/2006/wordml" xmlns:wps="http://schemas.microsoft.com/office/word/2010/wordprocessingShape" mc:Ignorable="w14 w15 w16se w16cid w16 w16cex w16sdtdh w16sdtfl w16du wp14">
+  <w:abstractNum w:abstractNumId="0" w15:restartNumberingAfterBreak="0">
+    <w:nsid w:val="02286C74"/>
+    <w:multiLevelType w:val="hybridMultilevel"/>
+    <w:tmpl w:val="F07AFA4C"/>
+    <w:lvl w:ilvl="0" w:tplc="0C00000F">
+      <w:start w:val="1"/>
+      <w:numFmt w:val="decimal"/>
+      <w:lvlText w:val="%1."/>
+      <w:lvlJc w:val="left"/>
+      <w:pPr>
+        <w:ind w:left="1440" w:hanging="360"/>
+      </w:pPr>
+    </w:lvl>
+    <w:lvl w:ilvl="1" w:tplc="0C000019" w:tentative="1">
+      <w:start w:val="1"/>
+      <w:numFmt w:val="lowerLetter"/>
+      <w:lvlText w:val="%2."/>
+      <w:lvlJc w:val="left"/>
+      <w:pPr>
+        <w:ind w:left="2160" w:hanging="360"/>
+      </w:pPr>
+    </w:lvl>
+    <w:lvl w:ilvl="2" w:tplc="0C00001B" w:tentative="1">
+      <w:start w:val="1"/>
+      <w:numFmt w:val="lowerRoman"/>
+      <w:lvlText w:val="%3."/>
+      <w:lvlJc w:val="right"/>
+      <w:pPr>
+        <w:ind w:left="2880" w:hanging="180"/>
+      </w:pPr>
+    </w:lvl>
+    <w:lvl w:ilvl="3" w:tplc="0C00000F" w:tentative="1">
+      <w:start w:val="1"/>
+      <w:numFmt w:val="decimal"/>
+      <w:lvlText w:val="%4."/>
+      <w:lvlJc w:val="left"/>
+      <w:pPr>
+        <w:ind w:left="3600" w:hanging="360"/>
+      </w:pPr>
+    </w:lvl>
+    <w:lvl w:ilvl="4" w:tplc="0C000019" w:tentative="1">
+      <w:start w:val="1"/>
+      <w:numFmt w:val="lowerLetter"/>
+      <w:lvlText w:val="%5."/>
+      <w:lvlJc w:val="left"/>
+      <w:pPr>
+        <w:ind w:left="4320" w:hanging="360"/>
+      </w:pPr>
+    </w:lvl>
+    <w:lvl w:ilvl="5" w:tplc="0C00001B" w:tentative="1">
+      <w:start w:val="1"/>
+      <w:numFmt w:val="lowerRoman"/>
+      <w:lvlText w:val="%6."/>
+      <w:lvlJc w:val="right"/>
+      <w:pPr>
+        <w:ind w:left="5040" w:hanging="180"/>
+      </w:pPr>
+    </w:lvl>
+    <w:lvl w:ilvl="6" w:tplc="0C00000F" w:tentative="1">
+      <w:start w:val="1"/>
+      <w:numFmt w:val="decimal"/>
+      <w:lvlText w:val="%7."/>
+      <w:lvlJc w:val="left"/>
+      <w:pPr>
+        <w:ind w:left="5760" w:hanging="360"/>
+      </w:pPr>
+    </w:lvl>
+    <w:lvl w:ilvl="7" w:tplc="0C000019" w:tentative="1">
+      <w:start w:val="1"/>
+      <w:numFmt w:val="lowerLetter"/>
+      <w:lvlText w:val="%8."/>
+      <w:lvlJc w:val="left"/>
+      <w:pPr>
+        <w:ind w:left="6480" w:hanging="360"/>
+      </w:pPr>
+    </w:lvl>
+    <w:lvl w:ilvl="8" w:tplc="0C00001B" w:tentative="1">
+      <w:start w:val="1"/>
+      <w:numFmt w:val="lowerRoman"/>
+      <w:lvlText w:val="%9."/>
+      <w:lvlJc w:val="right"/>
+      <w:pPr>
+        <w:ind w:left="7200" w:hanging="180"/>
+      </w:pPr>
+    </w:lvl>
+  </w:abstractNum>
+  <w:abstractNum w:abstractNumId="1" w15:restartNumberingAfterBreak="0">
+    <w:nsid w:val="0476564C"/>
+    <w:multiLevelType w:val="hybridMultilevel"/>
+    <w:tmpl w:val="DBC247B4"/>
+    <w:lvl w:ilvl="0" w:tplc="0C00000F">
+      <w:start w:val="1"/>
+      <w:numFmt w:val="decimal"/>
+      <w:lvlText w:val="%1."/>
+      <w:lvlJc w:val="left"/>
+      <w:pPr>
+        <w:ind w:left="720" w:hanging="360"/>
+      </w:pPr>
+    </w:lvl>
+    <w:lvl w:ilvl="1" w:tplc="0C000019" w:tentative="1">
+      <w:start w:val="1"/>
+      <w:numFmt w:val="lowerLetter"/>
+      <w:lvlText w:val="%2."/>
+      <w:lvlJc w:val="left"/>
+      <w:pPr>
+        <w:ind w:left="1440" w:hanging="360"/>
+      </w:pPr>
+    </w:lvl>
+    <w:lvl w:ilvl="2" w:tplc="0C00001B" w:tentative="1">
+      <w:start w:val="1"/>
+      <w:numFmt w:val="lowerRoman"/>
+      <w:lvlText w:val="%3."/>
+      <w:lvlJc w:val="right"/>
+      <w:pPr>
+        <w:ind w:left="2160" w:hanging="180"/>
+      </w:pPr>
+    </w:lvl>
+    <w:lvl w:ilvl="3" w:tplc="0C00000F" w:tentative="1">
+      <w:start w:val="1"/>
+      <w:numFmt w:val="decimal"/>
+      <w:lvlText w:val="%4."/>
+      <w:lvlJc w:val="left"/>
+      <w:pPr>
+        <w:ind w:left="2880" w:hanging="360"/>
+      </w:pPr>
+    </w:lvl>
+    <w:lvl w:ilvl="4" w:tplc="0C000019" w:tentative="1">
+      <w:start w:val="1"/>
+      <w:numFmt w:val="lowerLetter"/>
+      <w:lvlText w:val="%5."/>
+      <w:lvlJc w:val="left"/>
+      <w:pPr>
+        <w:ind w:left="3600" w:hanging="360"/>
+      </w:pPr>
+    </w:lvl>
+    <w:lvl w:ilvl="5" w:tplc="0C00001B" w:tentative="1">
+      <w:start w:val="1"/>
+      <w:numFmt w:val="lowerRoman"/>
+      <w:lvlText w:val="%6."/>
+      <w:lvlJc w:val="right"/>
+      <w:pPr>
+        <w:ind w:left="4320" w:hanging="180"/>
+      </w:pPr>
+    </w:lvl>
+    <w:lvl w:ilvl="6" w:tplc="0C00000F" w:tentative="1">
+      <w:start w:val="1"/>
+      <w:numFmt w:val="decimal"/>
+      <w:lvlText w:val="%7."/>
+      <w:lvlJc w:val="left"/>
+      <w:pPr>
+        <w:ind w:left="5040" w:hanging="360"/>
+      </w:pPr>
+    </w:lvl>
+    <w:lvl w:ilvl="7" w:tplc="0C000019" w:tentative="1">
+      <w:start w:val="1"/>
+      <w:numFmt w:val="lowerLetter"/>
+      <w:lvlText w:val="%8."/>
+      <w:lvlJc w:val="left"/>
+      <w:pPr>
+        <w:ind w:left="5760" w:hanging="360"/>
+      </w:pPr>
+    </w:lvl>
+    <w:lvl w:ilvl="8" w:tplc="0C00001B" w:tentative="1">
+      <w:start w:val="1"/>
+      <w:numFmt w:val="lowerRoman"/>
+      <w:lvlText w:val="%9."/>
+      <w:lvlJc w:val="right"/>
+      <w:pPr>
+        <w:ind w:left="6480" w:hanging="180"/>
+      </w:pPr>
+    </w:lvl>
+  </w:abstractNum>
+  <w:num w:numId="1" w16cid:durableId="608926257">
+    <w:abstractNumId w:val="1"/>
+  </w:num>
+  <w:num w:numId="2" w16cid:durableId="2091997913">
+    <w:abstractNumId w:val="0"/>
+  </w:num>
+</w:numbering>
 </file>
 
 <file path=word/styles.xml><?xml version="1.0" encoding="utf-8"?>
@@ -1808,6 +2250,7 @@
   <w:style w:type="character" w:default="1" w:styleId="DefaultParagraphFont">
     <w:name w:val="Default Paragraph Font"/>
     <w:uiPriority w:val="1"/>
+    <w:semiHidden/>
     <w:unhideWhenUsed/>
   </w:style>
   <w:style w:type="table" w:default="1" w:styleId="TableNormal">

</xml_diff>

<commit_message>
Added grantt chart and problem statement
</commit_message>
<xml_diff>
--- a/Proposal.docx
+++ b/Proposal.docx
@@ -27,7 +27,7 @@
             <mc:AlternateContent>
               <mc:Choice Requires="wpg">
                 <w:drawing>
-                  <wp:anchor distT="0" distB="0" distL="114300" distR="114300" simplePos="0" relativeHeight="251659264" behindDoc="0" locked="0" layoutInCell="1" allowOverlap="1" wp14:anchorId="66B2E72E" wp14:editId="785BAD4B">
+                  <wp:anchor distT="0" distB="0" distL="114300" distR="114300" simplePos="0" relativeHeight="251659264" behindDoc="0" locked="0" layoutInCell="1" allowOverlap="1" wp14:anchorId="09E60981" wp14:editId="59076251">
                     <wp:simplePos x="0" y="0"/>
                     <wp:positionH relativeFrom="page">
                       <wp:align>right</wp:align>
@@ -215,13 +215,23 @@
                                           <w:szCs w:val="96"/>
                                         </w:rPr>
                                       </w:pPr>
+                                      <w:proofErr w:type="gramStart"/>
                                       <w:r>
                                         <w:rPr>
                                           <w:color w:val="FFFFFF" w:themeColor="background1"/>
                                           <w:sz w:val="96"/>
                                           <w:szCs w:val="96"/>
                                         </w:rPr>
-                                        <w:t xml:space="preserve">EW  Project </w:t>
+                                        <w:t>EW  Project</w:t>
+                                      </w:r>
+                                      <w:proofErr w:type="gramEnd"/>
+                                      <w:r>
+                                        <w:rPr>
+                                          <w:color w:val="FFFFFF" w:themeColor="background1"/>
+                                          <w:sz w:val="96"/>
+                                          <w:szCs w:val="96"/>
+                                        </w:rPr>
+                                        <w:t xml:space="preserve"> </w:t>
                                       </w:r>
                                     </w:p>
                                   </w:sdtContent>
@@ -287,93 +297,7 @@
                                       <w:color w:val="FFFFFF" w:themeColor="background1"/>
                                     </w:rPr>
                                   </w:pPr>
-                                  <w:sdt>
-                                    <w:sdtPr>
-                                      <w:rPr>
-                                        <w:color w:val="FFFFFF" w:themeColor="background1"/>
-                                      </w:rPr>
-                                      <w:alias w:val="Author"/>
-                                      <w:id w:val="1380359617"/>
-                                      <w:dataBinding w:prefixMappings="xmlns:ns0='http://schemas.openxmlformats.org/package/2006/metadata/core-properties' xmlns:ns1='http://purl.org/dc/elements/1.1/'" w:xpath="/ns0:coreProperties[1]/ns1:creator[1]" w:storeItemID="{6C3C8BC8-F283-45AE-878A-BAB7291924A1}"/>
-                                      <w:text/>
-                                    </w:sdtPr>
-                                    <w:sdtContent>
-                                      <w:r>
-                                        <w:rPr>
-                                          <w:color w:val="FFFFFF" w:themeColor="background1"/>
-                                        </w:rPr>
-                                        <w:t>Hamza Shahzad</w:t>
-                                      </w:r>
-                                    </w:sdtContent>
-                                  </w:sdt>
-                                  <w:r>
-                                    <w:rPr>
-                                      <w:color w:val="FFFFFF" w:themeColor="background1"/>
-                                    </w:rPr>
-                                    <w:t xml:space="preserve"> Sarim Sajjad</w:t>
-                                  </w:r>
                                 </w:p>
-                                <w:sdt>
-                                  <w:sdtPr>
-                                    <w:rPr>
-                                      <w:color w:val="FFFFFF" w:themeColor="background1"/>
-                                    </w:rPr>
-                                    <w:alias w:val="Company"/>
-                                    <w:id w:val="1760174317"/>
-                                    <w:dataBinding w:prefixMappings="xmlns:ns0='http://schemas.openxmlformats.org/officeDocument/2006/extended-properties'" w:xpath="/ns0:Properties[1]/ns0:Company[1]" w:storeItemID="{6668398D-A668-4E3E-A5EB-62B293D839F1}"/>
-                                    <w:text/>
-                                  </w:sdtPr>
-                                  <w:sdtContent>
-                                    <w:p>
-                                      <w:pPr>
-                                        <w:pStyle w:val="NoSpacing"/>
-                                        <w:spacing w:line="360" w:lineRule="auto"/>
-                                        <w:rPr>
-                                          <w:color w:val="FFFFFF" w:themeColor="background1"/>
-                                        </w:rPr>
-                                      </w:pPr>
-                                      <w:r>
-                                        <w:rPr>
-                                          <w:color w:val="FFFFFF" w:themeColor="background1"/>
-                                        </w:rPr>
-                                        <w:t>25i-6520                         25i-6529</w:t>
-                                      </w:r>
-                                    </w:p>
-                                  </w:sdtContent>
-                                </w:sdt>
-                                <w:sdt>
-                                  <w:sdtPr>
-                                    <w:rPr>
-                                      <w:color w:val="FFFFFF" w:themeColor="background1"/>
-                                    </w:rPr>
-                                    <w:alias w:val="Date"/>
-                                    <w:id w:val="1724480474"/>
-                                    <w:dataBinding w:prefixMappings="xmlns:ns0='http://schemas.microsoft.com/office/2006/coverPageProps'" w:xpath="/ns0:CoverPageProperties[1]/ns0:PublishDate[1]" w:storeItemID="{55AF091B-3C7A-41E3-B477-F2FDAA23CFDA}"/>
-                                    <w:date>
-                                      <w:dateFormat w:val="M/d/yyyy"/>
-                                      <w:lid w:val="en-US"/>
-                                      <w:storeMappedDataAs w:val="dateTime"/>
-                                      <w:calendar w:val="gregorian"/>
-                                    </w:date>
-                                  </w:sdtPr>
-                                  <w:sdtContent>
-                                    <w:p>
-                                      <w:pPr>
-                                        <w:pStyle w:val="NoSpacing"/>
-                                        <w:spacing w:line="360" w:lineRule="auto"/>
-                                        <w:rPr>
-                                          <w:color w:val="FFFFFF" w:themeColor="background1"/>
-                                        </w:rPr>
-                                      </w:pPr>
-                                      <w:r>
-                                        <w:rPr>
-                                          <w:color w:val="FFFFFF" w:themeColor="background1"/>
-                                        </w:rPr>
-                                        <w:t xml:space="preserve">EW  Project </w:t>
-                                      </w:r>
-                                    </w:p>
-                                  </w:sdtContent>
-                                </w:sdt>
                               </w:txbxContent>
                             </wps:txbx>
                             <wps:bodyPr rot="0" vert="horz" wrap="square" lIns="365760" tIns="182880" rIns="182880" bIns="182880" anchor="b" anchorCtr="0" upright="1">
@@ -394,7 +318,7 @@
               </mc:Choice>
               <mc:Fallback>
                 <w:pict>
-                  <v:group w14:anchorId="66B2E72E" id="Group 252" o:spid="_x0000_s1026" style="position:absolute;margin-left:193.95pt;margin-top:0;width:245.15pt;height:11in;z-index:251659264;mso-width-percent:400;mso-height-percent:1000;mso-position-horizontal:right;mso-position-horizontal-relative:page;mso-position-vertical:top;mso-position-vertical-relative:page;mso-width-percent:400;mso-height-percent:1000" coordsize="31136,100584" o:gfxdata="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">
+                  <v:group w14:anchorId="09E60981" id="Group 252" o:spid="_x0000_s1026" style="position:absolute;margin-left:193.95pt;margin-top:0;width:245.15pt;height:11in;z-index:251659264;mso-width-percent:400;mso-height-percent:1000;mso-position-horizontal:right;mso-position-horizontal-relative:page;mso-position-vertical:top;mso-position-vertical-relative:page;mso-width-percent:400;mso-height-percent:1000" coordsize="31136,100584" o:gfxdata="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">
                     <v:rect id="Rectangle 459" o:spid="_x0000_s1027" alt="Light vertical" style="position:absolute;width:1385;height:100584;visibility:visible;mso-wrap-style:square;v-text-anchor:middle" o:gfxdata="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" fillcolor="#c3a5a5 [1945]" stroked="f" strokecolor="white" strokeweight="1pt">
                       <v:fill r:id="rId6" o:title="" opacity="52428f" color2="white [3212]" o:opacity2="52428f" type="pattern"/>
                       <v:shadow color="#d8d8d8" offset="3pt,3pt"/>
@@ -432,13 +356,23 @@
                                     <w:szCs w:val="96"/>
                                   </w:rPr>
                                 </w:pPr>
+                                <w:proofErr w:type="gramStart"/>
                                 <w:r>
                                   <w:rPr>
                                     <w:color w:val="FFFFFF" w:themeColor="background1"/>
                                     <w:sz w:val="96"/>
                                     <w:szCs w:val="96"/>
                                   </w:rPr>
-                                  <w:t xml:space="preserve">EW  Project </w:t>
+                                  <w:t>EW  Project</w:t>
+                                </w:r>
+                                <w:proofErr w:type="gramEnd"/>
+                                <w:r>
+                                  <w:rPr>
+                                    <w:color w:val="FFFFFF" w:themeColor="background1"/>
+                                    <w:sz w:val="96"/>
+                                    <w:szCs w:val="96"/>
+                                  </w:rPr>
+                                  <w:t xml:space="preserve"> </w:t>
                                 </w:r>
                               </w:p>
                             </w:sdtContent>
@@ -459,93 +393,7 @@
                                 <w:color w:val="FFFFFF" w:themeColor="background1"/>
                               </w:rPr>
                             </w:pPr>
-                            <w:sdt>
-                              <w:sdtPr>
-                                <w:rPr>
-                                  <w:color w:val="FFFFFF" w:themeColor="background1"/>
-                                </w:rPr>
-                                <w:alias w:val="Author"/>
-                                <w:id w:val="1380359617"/>
-                                <w:dataBinding w:prefixMappings="xmlns:ns0='http://schemas.openxmlformats.org/package/2006/metadata/core-properties' xmlns:ns1='http://purl.org/dc/elements/1.1/'" w:xpath="/ns0:coreProperties[1]/ns1:creator[1]" w:storeItemID="{6C3C8BC8-F283-45AE-878A-BAB7291924A1}"/>
-                                <w:text/>
-                              </w:sdtPr>
-                              <w:sdtContent>
-                                <w:r>
-                                  <w:rPr>
-                                    <w:color w:val="FFFFFF" w:themeColor="background1"/>
-                                  </w:rPr>
-                                  <w:t>Hamza Shahzad</w:t>
-                                </w:r>
-                              </w:sdtContent>
-                            </w:sdt>
-                            <w:r>
-                              <w:rPr>
-                                <w:color w:val="FFFFFF" w:themeColor="background1"/>
-                              </w:rPr>
-                              <w:t xml:space="preserve"> Sarim Sajjad</w:t>
-                            </w:r>
                           </w:p>
-                          <w:sdt>
-                            <w:sdtPr>
-                              <w:rPr>
-                                <w:color w:val="FFFFFF" w:themeColor="background1"/>
-                              </w:rPr>
-                              <w:alias w:val="Company"/>
-                              <w:id w:val="1760174317"/>
-                              <w:dataBinding w:prefixMappings="xmlns:ns0='http://schemas.openxmlformats.org/officeDocument/2006/extended-properties'" w:xpath="/ns0:Properties[1]/ns0:Company[1]" w:storeItemID="{6668398D-A668-4E3E-A5EB-62B293D839F1}"/>
-                              <w:text/>
-                            </w:sdtPr>
-                            <w:sdtContent>
-                              <w:p>
-                                <w:pPr>
-                                  <w:pStyle w:val="NoSpacing"/>
-                                  <w:spacing w:line="360" w:lineRule="auto"/>
-                                  <w:rPr>
-                                    <w:color w:val="FFFFFF" w:themeColor="background1"/>
-                                  </w:rPr>
-                                </w:pPr>
-                                <w:r>
-                                  <w:rPr>
-                                    <w:color w:val="FFFFFF" w:themeColor="background1"/>
-                                  </w:rPr>
-                                  <w:t>25i-6520                         25i-6529</w:t>
-                                </w:r>
-                              </w:p>
-                            </w:sdtContent>
-                          </w:sdt>
-                          <w:sdt>
-                            <w:sdtPr>
-                              <w:rPr>
-                                <w:color w:val="FFFFFF" w:themeColor="background1"/>
-                              </w:rPr>
-                              <w:alias w:val="Date"/>
-                              <w:id w:val="1724480474"/>
-                              <w:dataBinding w:prefixMappings="xmlns:ns0='http://schemas.microsoft.com/office/2006/coverPageProps'" w:xpath="/ns0:CoverPageProperties[1]/ns0:PublishDate[1]" w:storeItemID="{55AF091B-3C7A-41E3-B477-F2FDAA23CFDA}"/>
-                              <w:date>
-                                <w:dateFormat w:val="M/d/yyyy"/>
-                                <w:lid w:val="en-US"/>
-                                <w:storeMappedDataAs w:val="dateTime"/>
-                                <w:calendar w:val="gregorian"/>
-                              </w:date>
-                            </w:sdtPr>
-                            <w:sdtContent>
-                              <w:p>
-                                <w:pPr>
-                                  <w:pStyle w:val="NoSpacing"/>
-                                  <w:spacing w:line="360" w:lineRule="auto"/>
-                                  <w:rPr>
-                                    <w:color w:val="FFFFFF" w:themeColor="background1"/>
-                                  </w:rPr>
-                                </w:pPr>
-                                <w:r>
-                                  <w:rPr>
-                                    <w:color w:val="FFFFFF" w:themeColor="background1"/>
-                                  </w:rPr>
-                                  <w:t xml:space="preserve">EW  Project </w:t>
-                                </w:r>
-                              </w:p>
-                            </w:sdtContent>
-                          </w:sdt>
                         </w:txbxContent>
                       </v:textbox>
                     </v:rect>
@@ -562,7 +410,7 @@
             <mc:AlternateContent>
               <mc:Choice Requires="wps">
                 <w:drawing>
-                  <wp:anchor distT="0" distB="0" distL="114300" distR="114300" simplePos="0" relativeHeight="251661312" behindDoc="0" locked="0" layoutInCell="0" allowOverlap="1" wp14:anchorId="7014116D" wp14:editId="4CED741D">
+                  <wp:anchor distT="0" distB="0" distL="114300" distR="114300" simplePos="0" relativeHeight="251661312" behindDoc="0" locked="0" layoutInCell="0" allowOverlap="1" wp14:anchorId="0B53B012" wp14:editId="24965292">
                     <wp:simplePos x="0" y="0"/>
                     <wp:positionH relativeFrom="page">
                       <wp:align>left</wp:align>
@@ -667,7 +515,7 @@
               </mc:Choice>
               <mc:Fallback>
                 <w:pict>
-                  <v:rect w14:anchorId="7014116D" id="Rectangle 16" o:spid="_x0000_s1031" style="position:absolute;margin-left:0;margin-top:0;width:548.85pt;height:50.4pt;z-index:251661312;visibility:visible;mso-wrap-style:square;mso-width-percent:900;mso-height-percent:73;mso-top-percent:250;mso-wrap-distance-left:9pt;mso-wrap-distance-top:0;mso-wrap-distance-right:9pt;mso-wrap-distance-bottom:0;mso-position-horizontal:left;mso-position-horizontal-relative:page;mso-position-vertical-relative:page;mso-width-percent:900;mso-height-percent:73;mso-top-percent:250;mso-width-relative:page;mso-height-relative:page;v-text-anchor:middle" o:gfxdata="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" o:allowincell="f" fillcolor="black [3213]" strokecolor="black [3213]" strokeweight="1.5pt">
+                  <v:rect w14:anchorId="0B53B012" id="Rectangle 16" o:spid="_x0000_s1031" style="position:absolute;margin-left:0;margin-top:0;width:548.85pt;height:50.4pt;z-index:251661312;visibility:visible;mso-wrap-style:square;mso-width-percent:900;mso-height-percent:73;mso-top-percent:250;mso-wrap-distance-left:9pt;mso-wrap-distance-top:0;mso-wrap-distance-right:9pt;mso-wrap-distance-bottom:0;mso-position-horizontal:left;mso-position-horizontal-relative:page;mso-position-vertical-relative:page;mso-width-percent:900;mso-height-percent:73;mso-top-percent:250;mso-width-relative:page;mso-height-relative:page;v-text-anchor:middle" o:gfxdata="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" o:allowincell="f" fillcolor="black [3213]" strokecolor="black [3213]" strokeweight="1.5pt">
                     <v:textbox style="mso-fit-shape-to-text:t" inset="14.4pt,,14.4pt">
                       <w:txbxContent>
                         <w:sdt>
@@ -727,7 +575,7 @@
               <w:noProof/>
             </w:rPr>
             <w:drawing>
-              <wp:anchor distT="0" distB="0" distL="114300" distR="114300" simplePos="0" relativeHeight="251660288" behindDoc="0" locked="0" layoutInCell="0" allowOverlap="1" wp14:anchorId="4C8C5D91" wp14:editId="3C61F2C7">
+              <wp:anchor distT="0" distB="0" distL="114300" distR="114300" simplePos="0" relativeHeight="251660288" behindDoc="0" locked="0" layoutInCell="0" allowOverlap="1" wp14:anchorId="35EA6F13" wp14:editId="7DB4030A">
                 <wp:simplePos x="0" y="0"/>
                 <wp:positionH relativeFrom="page">
                   <wp:posOffset>2194560</wp:posOffset>
@@ -797,35 +645,6 @@
         </w:p>
       </w:sdtContent>
     </w:sdt>
-    <w:p/>
-    <w:p/>
-    <w:p/>
-    <w:p/>
-    <w:p/>
-    <w:p/>
-    <w:p/>
-    <w:p/>
-    <w:p/>
-    <w:p/>
-    <w:p/>
-    <w:p/>
-    <w:p/>
-    <w:p/>
-    <w:p/>
-    <w:p/>
-    <w:p/>
-    <w:p/>
-    <w:p/>
-    <w:p/>
-    <w:p/>
-    <w:p/>
-    <w:p/>
-    <w:p/>
-    <w:p/>
-    <w:p/>
-    <w:p/>
-    <w:p/>
-    <w:p/>
     <w:p>
       <w:pPr>
         <w:rPr>
@@ -843,6 +662,135 @@
           <w:szCs w:val="32"/>
         </w:rPr>
         <w:lastRenderedPageBreak/>
+        <w:t>GROUP MEMBERS:</w:t>
+      </w:r>
+    </w:p>
+    <w:p>
+      <w:r>
+        <w:rPr>
+          <w:b/>
+          <w:bCs/>
+          <w:sz w:val="24"/>
+          <w:szCs w:val="24"/>
+        </w:rPr>
+        <w:t>Hamza Shahzad</w:t>
+      </w:r>
+      <w:r>
+        <w:rPr>
+          <w:sz w:val="24"/>
+          <w:szCs w:val="24"/>
+        </w:rPr>
+        <w:t xml:space="preserve"> </w:t>
+      </w:r>
+      <w:r>
+        <w:t>– 25i-6520 – CE-C</w:t>
+      </w:r>
+    </w:p>
+    <w:p>
+      <w:r>
+        <w:rPr>
+          <w:b/>
+          <w:bCs/>
+          <w:sz w:val="24"/>
+          <w:szCs w:val="24"/>
+        </w:rPr>
+        <w:t>M. Sarim Sajjad</w:t>
+      </w:r>
+      <w:r>
+        <w:rPr>
+          <w:sz w:val="24"/>
+          <w:szCs w:val="24"/>
+        </w:rPr>
+        <w:t xml:space="preserve"> </w:t>
+      </w:r>
+      <w:r>
+        <w:t>– 25i-6529 – CE-C</w:t>
+      </w:r>
+    </w:p>
+    <w:p>
+      <w:pPr>
+        <w:rPr>
+          <w:b/>
+          <w:bCs/>
+          <w:sz w:val="32"/>
+          <w:szCs w:val="32"/>
+        </w:rPr>
+      </w:pPr>
+      <w:r>
+        <w:rPr>
+          <w:b/>
+          <w:bCs/>
+          <w:sz w:val="32"/>
+          <w:szCs w:val="32"/>
+        </w:rPr>
+        <w:t>Problem Statement:</w:t>
+      </w:r>
+    </w:p>
+    <w:p>
+      <w:pPr>
+        <w:rPr>
+          <w:sz w:val="28"/>
+          <w:szCs w:val="28"/>
+        </w:rPr>
+      </w:pPr>
+      <w:r>
+        <w:rPr>
+          <w:sz w:val="28"/>
+          <w:szCs w:val="28"/>
+        </w:rPr>
+        <w:t>Inspection of hazardous or hard to reach areas require FPV (first person view) vehicles. But the commercially available options are usually very expensive and the hardware is of a closed eco-system. On the other hand, cheaper options rely on Wi-Fi and Bluetooth for communication, which results in significant latency, which might cause delayed video and sluggish controls, making the device prone to accidents in what was supposed to be an easy to do, safe, out of sight mission.</w:t>
+      </w:r>
+    </w:p>
+    <w:p>
+      <w:pPr>
+        <w:rPr>
+          <w:b/>
+          <w:bCs/>
+          <w:sz w:val="32"/>
+          <w:szCs w:val="32"/>
+        </w:rPr>
+      </w:pPr>
+      <w:r>
+        <w:rPr>
+          <w:b/>
+          <w:bCs/>
+          <w:sz w:val="32"/>
+          <w:szCs w:val="32"/>
+        </w:rPr>
+        <w:t>Proposed Solution:</w:t>
+      </w:r>
+    </w:p>
+    <w:p>
+      <w:pPr>
+        <w:rPr>
+          <w:sz w:val="28"/>
+          <w:szCs w:val="28"/>
+        </w:rPr>
+      </w:pPr>
+      <w:r>
+        <w:rPr>
+          <w:sz w:val="28"/>
+          <w:szCs w:val="28"/>
+        </w:rPr>
+        <w:t xml:space="preserve">We propose a cost effective FPV vehicle solution, which uses 2 ESP32 microcontrollers. By using the available peer-to-peer protocol ESP NOW, we minimize communication latency, making for instantaneous control. It will be paired with an ESP CAM for live video stream, and dual ultra sonic sensors for collision avoidance. Thus, enabling us a reliable, inexpensive device for remote inspection in hard-to-reach areas.  </w:t>
+      </w:r>
+    </w:p>
+    <w:p>
+      <w:pPr>
+        <w:rPr>
+          <w:b/>
+          <w:bCs/>
+          <w:sz w:val="32"/>
+          <w:szCs w:val="32"/>
+        </w:rPr>
+      </w:pPr>
+      <w:r>
+        <w:rPr>
+          <w:b/>
+          <w:bCs/>
+          <w:sz w:val="32"/>
+          <w:szCs w:val="32"/>
+        </w:rPr>
         <w:t>List of Components:</w:t>
       </w:r>
     </w:p>
@@ -857,14 +805,14 @@
         <w:rPr>
           <w:b/>
           <w:bCs/>
-          <w:sz w:val="32"/>
-          <w:szCs w:val="32"/>
+          <w:sz w:val="28"/>
+          <w:szCs w:val="28"/>
         </w:rPr>
       </w:pPr>
       <w:r>
         <w:rPr>
-          <w:sz w:val="32"/>
-          <w:szCs w:val="32"/>
+          <w:sz w:val="28"/>
+          <w:szCs w:val="28"/>
         </w:rPr>
         <w:t>DOIT ESP32 DEVKIT V1 (x2)</w:t>
       </w:r>
@@ -880,14 +828,14 @@
         <w:rPr>
           <w:b/>
           <w:bCs/>
-          <w:sz w:val="32"/>
-          <w:szCs w:val="32"/>
+          <w:sz w:val="28"/>
+          <w:szCs w:val="28"/>
         </w:rPr>
       </w:pPr>
       <w:r>
         <w:rPr>
-          <w:sz w:val="32"/>
-          <w:szCs w:val="32"/>
+          <w:sz w:val="28"/>
+          <w:szCs w:val="28"/>
         </w:rPr>
         <w:t>AI Thinker ESP32 CAM</w:t>
       </w:r>
@@ -903,14 +851,14 @@
         <w:rPr>
           <w:b/>
           <w:bCs/>
-          <w:sz w:val="32"/>
-          <w:szCs w:val="32"/>
+          <w:sz w:val="28"/>
+          <w:szCs w:val="28"/>
         </w:rPr>
       </w:pPr>
       <w:r>
         <w:rPr>
-          <w:sz w:val="32"/>
-          <w:szCs w:val="32"/>
+          <w:sz w:val="28"/>
+          <w:szCs w:val="28"/>
         </w:rPr>
         <w:t>4WD Car Chassis kit with 4 DC Gear Motors</w:t>
       </w:r>
@@ -926,14 +874,14 @@
         <w:rPr>
           <w:b/>
           <w:bCs/>
-          <w:sz w:val="32"/>
-          <w:szCs w:val="32"/>
+          <w:sz w:val="28"/>
+          <w:szCs w:val="28"/>
         </w:rPr>
       </w:pPr>
       <w:r>
         <w:rPr>
-          <w:sz w:val="32"/>
-          <w:szCs w:val="32"/>
+          <w:sz w:val="28"/>
+          <w:szCs w:val="28"/>
         </w:rPr>
         <w:t xml:space="preserve"> Male to Male Jumper Wires</w:t>
       </w:r>
@@ -949,14 +897,14 @@
         <w:rPr>
           <w:b/>
           <w:bCs/>
-          <w:sz w:val="32"/>
-          <w:szCs w:val="32"/>
+          <w:sz w:val="28"/>
+          <w:szCs w:val="28"/>
         </w:rPr>
       </w:pPr>
       <w:r>
         <w:rPr>
-          <w:sz w:val="32"/>
-          <w:szCs w:val="32"/>
+          <w:sz w:val="28"/>
+          <w:szCs w:val="28"/>
         </w:rPr>
         <w:t>Female to Male Jumper Wires</w:t>
       </w:r>
@@ -972,14 +920,14 @@
         <w:rPr>
           <w:b/>
           <w:bCs/>
-          <w:sz w:val="32"/>
-          <w:szCs w:val="32"/>
+          <w:sz w:val="28"/>
+          <w:szCs w:val="28"/>
         </w:rPr>
       </w:pPr>
       <w:r>
         <w:rPr>
-          <w:sz w:val="32"/>
-          <w:szCs w:val="32"/>
+          <w:sz w:val="28"/>
+          <w:szCs w:val="28"/>
         </w:rPr>
         <w:t>Female to Female Jumper Wires</w:t>
       </w:r>
@@ -995,14 +943,14 @@
         <w:rPr>
           <w:b/>
           <w:bCs/>
-          <w:sz w:val="32"/>
-          <w:szCs w:val="32"/>
+          <w:sz w:val="28"/>
+          <w:szCs w:val="28"/>
         </w:rPr>
       </w:pPr>
       <w:r>
         <w:rPr>
-          <w:sz w:val="32"/>
-          <w:szCs w:val="32"/>
+          <w:sz w:val="28"/>
+          <w:szCs w:val="28"/>
         </w:rPr>
         <w:t>2 Axis Joystick Modules (x2)</w:t>
       </w:r>
@@ -1018,14 +966,14 @@
         <w:rPr>
           <w:b/>
           <w:bCs/>
-          <w:sz w:val="32"/>
-          <w:szCs w:val="32"/>
+          <w:sz w:val="28"/>
+          <w:szCs w:val="28"/>
         </w:rPr>
       </w:pPr>
       <w:r>
         <w:rPr>
-          <w:sz w:val="32"/>
-          <w:szCs w:val="32"/>
+          <w:sz w:val="28"/>
+          <w:szCs w:val="28"/>
         </w:rPr>
         <w:t>SG-90, 180-degree servo motor</w:t>
       </w:r>
@@ -1041,14 +989,14 @@
         <w:rPr>
           <w:b/>
           <w:bCs/>
-          <w:sz w:val="32"/>
-          <w:szCs w:val="32"/>
+          <w:sz w:val="28"/>
+          <w:szCs w:val="28"/>
         </w:rPr>
       </w:pPr>
       <w:r>
         <w:rPr>
-          <w:sz w:val="32"/>
-          <w:szCs w:val="32"/>
+          <w:sz w:val="28"/>
+          <w:szCs w:val="28"/>
         </w:rPr>
         <w:t>Li-ion Batteries</w:t>
       </w:r>
@@ -1064,14 +1012,14 @@
         <w:rPr>
           <w:b/>
           <w:bCs/>
-          <w:sz w:val="32"/>
-          <w:szCs w:val="32"/>
+          <w:sz w:val="28"/>
+          <w:szCs w:val="28"/>
         </w:rPr>
       </w:pPr>
       <w:r>
         <w:rPr>
-          <w:sz w:val="32"/>
-          <w:szCs w:val="32"/>
+          <w:sz w:val="28"/>
+          <w:szCs w:val="28"/>
         </w:rPr>
         <w:t>Buck Convertor LM2596</w:t>
       </w:r>
@@ -1087,14 +1035,14 @@
         <w:rPr>
           <w:b/>
           <w:bCs/>
-          <w:sz w:val="32"/>
-          <w:szCs w:val="32"/>
+          <w:sz w:val="28"/>
+          <w:szCs w:val="28"/>
         </w:rPr>
       </w:pPr>
       <w:r>
         <w:rPr>
-          <w:sz w:val="32"/>
-          <w:szCs w:val="32"/>
+          <w:sz w:val="28"/>
+          <w:szCs w:val="28"/>
         </w:rPr>
         <w:t>L298N motor driver</w:t>
       </w:r>
@@ -1110,16 +1058,40 @@
         <w:rPr>
           <w:b/>
           <w:bCs/>
-          <w:sz w:val="32"/>
-          <w:szCs w:val="32"/>
+          <w:sz w:val="28"/>
+          <w:szCs w:val="28"/>
         </w:rPr>
       </w:pPr>
       <w:r>
         <w:rPr>
-          <w:sz w:val="32"/>
-          <w:szCs w:val="32"/>
+          <w:sz w:val="28"/>
+          <w:szCs w:val="28"/>
         </w:rPr>
         <w:t>AA battery housing</w:t>
+      </w:r>
+    </w:p>
+    <w:p>
+      <w:pPr>
+        <w:pStyle w:val="ListParagraph"/>
+        <w:numPr>
+          <w:ilvl w:val="0"/>
+          <w:numId w:val="2"/>
+        </w:numPr>
+        <w:ind w:left="1080"/>
+        <w:rPr>
+          <w:b/>
+          <w:bCs/>
+          <w:sz w:val="28"/>
+          <w:szCs w:val="28"/>
+        </w:rPr>
+      </w:pPr>
+      <w:r>
+        <w:rPr>
+          <w:sz w:val="28"/>
+          <w:szCs w:val="28"/>
+        </w:rPr>
+        <w:lastRenderedPageBreak/>
+        <w:t>Ultrasonic sensors (x2)</w:t>
       </w:r>
     </w:p>
     <w:p>
@@ -1199,7 +1171,7 @@
                 <w:szCs w:val="32"/>
               </w:rPr>
               <w:drawing>
-                <wp:inline distT="0" distB="0" distL="0" distR="0" wp14:anchorId="1A3B730C" wp14:editId="75B956DE">
+                <wp:inline distT="0" distB="0" distL="0" distR="0" wp14:anchorId="7DE5A059" wp14:editId="6D457123">
                   <wp:extent cx="5943600" cy="3554095"/>
                   <wp:effectExtent l="0" t="0" r="0" b="8255"/>
                   <wp:docPr id="994586141" name="Picture 1"/>
@@ -1294,7 +1266,7 @@
               </w:rPr>
               <w:lastRenderedPageBreak/>
               <w:drawing>
-                <wp:inline distT="0" distB="0" distL="0" distR="0" wp14:anchorId="70AA7B47" wp14:editId="54121398">
+                <wp:inline distT="0" distB="0" distL="0" distR="0" wp14:anchorId="1C1240D5" wp14:editId="034DDB43">
                   <wp:extent cx="3900904" cy="3497580"/>
                   <wp:effectExtent l="0" t="0" r="4445" b="7620"/>
                   <wp:docPr id="1208197362" name="Picture 2"/>
@@ -1387,7 +1359,7 @@
                 <w:szCs w:val="32"/>
               </w:rPr>
               <w:drawing>
-                <wp:inline distT="0" distB="0" distL="0" distR="0" wp14:anchorId="77164911" wp14:editId="691178A3">
+                <wp:inline distT="0" distB="0" distL="0" distR="0" wp14:anchorId="5CE14F70" wp14:editId="4AB15B13">
                   <wp:extent cx="5943600" cy="2879090"/>
                   <wp:effectExtent l="0" t="0" r="0" b="0"/>
                   <wp:docPr id="137626483" name="Picture 3"/>
@@ -1445,13 +1417,95 @@
     <w:p>
       <w:pPr>
         <w:rPr>
+          <w:sz w:val="32"/>
+          <w:szCs w:val="32"/>
+        </w:rPr>
+      </w:pPr>
+      <w:r>
+        <w:rPr>
           <w:b/>
           <w:bCs/>
           <w:sz w:val="32"/>
           <w:szCs w:val="32"/>
         </w:rPr>
-      </w:pPr>
+        <w:t xml:space="preserve">Timeline </w:t>
+      </w:r>
+      <w:r>
+        <w:rPr>
+          <w:sz w:val="32"/>
+          <w:szCs w:val="32"/>
+        </w:rPr>
+        <w:t>(Gantt Chart)</w:t>
+      </w:r>
+      <w:r>
+        <w:rPr>
+          <w:sz w:val="32"/>
+          <w:szCs w:val="32"/>
+        </w:rPr>
+        <w:t>:</w:t>
+      </w:r>
     </w:p>
+    <w:p>
+      <w:pPr>
+        <w:rPr>
+          <w:sz w:val="32"/>
+          <w:szCs w:val="32"/>
+        </w:rPr>
+      </w:pPr>
+      <w:r>
+        <w:rPr>
+          <w:sz w:val="32"/>
+          <w:szCs w:val="32"/>
+        </w:rPr>
+        <w:lastRenderedPageBreak/>
+        <w:drawing>
+          <wp:inline distT="0" distB="0" distL="0" distR="0" wp14:anchorId="10FFBB27" wp14:editId="3DBB7314">
+            <wp:extent cx="5943600" cy="3409950"/>
+            <wp:effectExtent l="0" t="0" r="0" b="0"/>
+            <wp:docPr id="1076703731" name="Picture 1"/>
+            <wp:cNvGraphicFramePr>
+              <a:graphicFrameLocks xmlns:a="http://schemas.openxmlformats.org/drawingml/2006/main" noChangeAspect="1"/>
+            </wp:cNvGraphicFramePr>
+            <a:graphic xmlns:a="http://schemas.openxmlformats.org/drawingml/2006/main">
+              <a:graphicData uri="http://schemas.openxmlformats.org/drawingml/2006/picture">
+                <pic:pic xmlns:pic="http://schemas.openxmlformats.org/drawingml/2006/picture">
+                  <pic:nvPicPr>
+                    <pic:cNvPr id="1076703731" name=""/>
+                    <pic:cNvPicPr/>
+                  </pic:nvPicPr>
+                  <pic:blipFill>
+                    <a:blip r:embed="rId11"/>
+                    <a:stretch>
+                      <a:fillRect/>
+                    </a:stretch>
+                  </pic:blipFill>
+                  <pic:spPr>
+                    <a:xfrm>
+                      <a:off x="0" y="0"/>
+                      <a:ext cx="5943600" cy="3409950"/>
+                    </a:xfrm>
+                    <a:prstGeom prst="rect">
+                      <a:avLst/>
+                    </a:prstGeom>
+                  </pic:spPr>
+                </pic:pic>
+              </a:graphicData>
+            </a:graphic>
+          </wp:inline>
+        </w:drawing>
+      </w:r>
+    </w:p>
+    <w:p>
+      <w:pPr>
+        <w:rPr>
+          <w:b/>
+          <w:bCs/>
+          <w:sz w:val="32"/>
+          <w:szCs w:val="32"/>
+        </w:rPr>
+      </w:pPr>
+    </w:p>
+    <w:p/>
     <w:sectPr>
       <w:pgSz w:w="12240" w:h="15840"/>
       <w:pgMar w:top="1440" w:right="1440" w:bottom="1440" w:left="1440" w:header="708" w:footer="708" w:gutter="0"/>
@@ -2047,6 +2101,7 @@
   <w:style w:type="paragraph" w:default="1" w:styleId="Normal">
     <w:name w:val="Normal"/>
     <w:qFormat/>
+    <w:rsid w:val="001225FE"/>
   </w:style>
   <w:style w:type="paragraph" w:styleId="Heading1">
     <w:name w:val="heading 1"/>

</xml_diff>